<commit_message>
Agregado el informe de la Tarea 5 (capítulo 20 - Protocolos de transporte)
</commit_message>
<xml_diff>
--- a/Tareas - Teórico/Tarea5/Redes2026-2doSem-Capa de Transporte-Actividades.docx
+++ b/Tareas - Teórico/Tarea5/Redes2026-2doSem-Capa de Transporte-Actividades.docx
@@ -4585,7 +4585,7 @@
           <w:szCs w:val="24"/>
           <w:lang w:val="en-US"/>
         </w:rPr>
-        <w:t xml:space="preserve">principals </w:t>
+        <w:t xml:space="preserve">principales </w:t>
       </w:r>
       <w:proofErr w:type="spellStart"/>
       <w:r>
@@ -6532,7 +6532,7 @@
           <w:color w:val="1F1F1F"/>
           <w:sz w:val="24"/>
         </w:rPr>
-        <w:t xml:space="preserve">Las dos funciones principales que </w:t>
+        <w:t xml:space="preserve"/>
       </w:r>
       <w:r>
         <w:rPr>
@@ -6550,7 +6550,7 @@
           <w:color w:val="1F1F1F"/>
           <w:sz w:val="24"/>
         </w:rPr>
-        <w:t xml:space="preserve"> dos funciones principales que IP:</w:t>
+        <w:t xml:space="preserve"> dos funciones principales que IP no ofrece:</w:t>
       </w:r>
     </w:p>
     <w:p>

</xml_diff>